<commit_message>
Increment 2: connector v1.2.0 — self-disconnect on revocation, persistent pairing, MarQira Pulse rename
- Heartbeat now detects HTTP 403 site_revoked and self-disconnects (stops cron,
  clears credentials); plain 403s never wipe credentials.
- Bump connector to 1.2.0, display name 'MarQira Pulse' (folder/slug/prefix
  unchanged; no reconnection required).
- API config marqira.plugin.latest_version defaults to 1.2.0 so the dashboard
  'Updates available' card works out of the box.
- New tests/test-site-revoked.php (13 tests); 73 connector tests pass, 92 API tests pass.
- Docs: RELEASE_1.2.0_DEPLOYMENT Increment 2 section.
</commit_message>
<xml_diff>
--- a/docs/RELEASE_1.2.0_DEPLOYMENT.docx
+++ b/docs/RELEASE_1.2.0_DEPLOYMENT.docx
@@ -2,7 +2,7 @@
 <file path=word/document.xml><?xml version="1.0" encoding="utf-8"?>
 <w:document xmlns:w="http://schemas.openxmlformats.org/wordprocessingml/2006/main" xmlns:m="http://schemas.openxmlformats.org/officeDocument/2006/math" xmlns:r="http://schemas.openxmlformats.org/officeDocument/2006/relationships" xmlns:o="urn:schemas-microsoft-com:office:office" xmlns:v="urn:schemas-microsoft-com:vml" xmlns:w10="urn:schemas-microsoft-com:office:word" xmlns:a="http://schemas.openxmlformats.org/drawingml/2006/main" xmlns:pic="http://schemas.openxmlformats.org/drawingml/2006/picture" xmlns:wp="http://schemas.openxmlformats.org/drawingml/2006/wordprocessingDrawing">
   <w:body>
-    <w:bookmarkStart w:id="25" w:name="Xccd526631e04a5a03c509a47fef5c0613bdb5fa"/>
+    <w:bookmarkStart w:id="31" w:name="Xccd526631e04a5a03c509a47fef5c0613bdb5fa"/>
     <w:p>
       <w:pPr>
         <w:pStyle w:val="Heading1"/>
@@ -916,9 +916,866 @@
         <w:t xml:space="preserve">are introduced in a later increment (offline alerting) and are documented then.</w:t>
       </w:r>
     </w:p>
+    <w:p>
+      <w:r>
+        <w:pict>
+          <v:rect style="width:0;height:1.5pt" o:hralign="center" o:hrstd="t" o:hr="t"/>
+        </w:pict>
+      </w:r>
+    </w:p>
     <w:bookmarkEnd w:id="23"/>
     <w:bookmarkEnd w:id="24"/>
+    <w:bookmarkStart w:id="30" w:name="Xd291c93ecd4fc2cea9c69d44452680a95628ba0"/>
+    <w:p>
+      <w:pPr>
+        <w:pStyle w:val="Heading2"/>
+      </w:pPr>
+      <w:r>
+        <w:t xml:space="preserve">Increment 2 — Connector lifecycle: persistent pairing, cron self-heal &amp; self-disconnect on revocation</w:t>
+      </w:r>
+    </w:p>
+    <w:p>
+      <w:pPr>
+        <w:pStyle w:val="FirstParagraph"/>
+      </w:pPr>
+      <w:r>
+        <w:t xml:space="preserve">Plugin version</w:t>
+      </w:r>
+      <w:r>
+        <w:t xml:space="preserve"> </w:t>
+      </w:r>
+      <w:r>
+        <w:rPr>
+          <w:bCs/>
+          <w:b/>
+        </w:rPr>
+        <w:t xml:space="preserve">1.2.0</w:t>
+      </w:r>
+      <w:r>
+        <w:t xml:space="preserve"> </w:t>
+      </w:r>
+      <w:r>
+        <w:t xml:space="preserve">(display name</w:t>
+      </w:r>
+      <w:r>
+        <w:t xml:space="preserve"> </w:t>
+      </w:r>
+      <w:r>
+        <w:rPr>
+          <w:bCs/>
+          <w:b/>
+        </w:rPr>
+        <w:t xml:space="preserve">MarQira Pulse</w:t>
+      </w:r>
+      <w:r>
+        <w:t xml:space="preserve">; folder/slug/prefix</w:t>
+      </w:r>
+      <w:r>
+        <w:t xml:space="preserve"> </w:t>
+      </w:r>
+      <w:r>
+        <w:t xml:space="preserve">unchanged at</w:t>
+      </w:r>
+      <w:r>
+        <w:t xml:space="preserve"> </w:t>
+      </w:r>
+      <w:r>
+        <w:rPr>
+          <w:rStyle w:val="VerbatimChar"/>
+        </w:rPr>
+        <w:t xml:space="preserve">marqira-connector</w:t>
+      </w:r>
+      <w:r>
+        <w:t xml:space="preserve">). This increment pairs the WordPress connector</w:t>
+      </w:r>
+      <w:r>
+        <w:t xml:space="preserve"> </w:t>
+      </w:r>
+      <w:r>
+        <w:t xml:space="preserve">with the revocation support shipped in Increment 1.</w:t>
+      </w:r>
+    </w:p>
+    <w:bookmarkStart w:id="25" w:name="what-changed-operationally-1"/>
+    <w:p>
+      <w:pPr>
+        <w:pStyle w:val="Heading3"/>
+      </w:pPr>
+      <w:r>
+        <w:t xml:space="preserve">What changed (operationally)</w:t>
+      </w:r>
+    </w:p>
+    <w:p>
+      <w:pPr>
+        <w:numPr>
+          <w:ilvl w:val="0"/>
+          <w:numId w:val="1004"/>
+        </w:numPr>
+        <w:pStyle w:val="Compact"/>
+      </w:pPr>
+      <w:r>
+        <w:rPr>
+          <w:bCs/>
+          <w:b/>
+        </w:rPr>
+        <w:t xml:space="preserve">Self-disconnect on revocation.</w:t>
+      </w:r>
+      <w:r>
+        <w:t xml:space="preserve"> </w:t>
+      </w:r>
+      <w:r>
+        <w:t xml:space="preserve">When a site is revoked from the dashboard,</w:t>
+      </w:r>
+      <w:r>
+        <w:t xml:space="preserve"> </w:t>
+      </w:r>
+      <w:r>
+        <w:t xml:space="preserve">the API already answers its next heartbeat with</w:t>
+      </w:r>
+      <w:r>
+        <w:t xml:space="preserve"> </w:t>
+      </w:r>
+      <w:r>
+        <w:rPr>
+          <w:rStyle w:val="VerbatimChar"/>
+        </w:rPr>
+        <w:t xml:space="preserve">HTTP 403   {"error":"site_revoked","site_revoked":true}</w:t>
+      </w:r>
+      <w:r>
+        <w:t xml:space="preserve"> </w:t>
+      </w:r>
+      <w:r>
+        <w:t xml:space="preserve">(Increment 1). The 1.2.0</w:t>
+      </w:r>
+      <w:r>
+        <w:t xml:space="preserve"> </w:t>
+      </w:r>
+      <w:r>
+        <w:t xml:space="preserve">connector now detects this and</w:t>
+      </w:r>
+      <w:r>
+        <w:t xml:space="preserve"> </w:t>
+      </w:r>
+      <w:r>
+        <w:rPr>
+          <w:bCs/>
+          <w:b/>
+        </w:rPr>
+        <w:t xml:space="preserve">stops its heartbeat cron and clears its stored</w:t>
+      </w:r>
+      <w:r>
+        <w:rPr>
+          <w:bCs/>
+          <w:b/>
+        </w:rPr>
+        <w:t xml:space="preserve"> </w:t>
+      </w:r>
+      <w:r>
+        <w:rPr>
+          <w:bCs/>
+          <w:b/>
+        </w:rPr>
+        <w:t xml:space="preserve">credentials</w:t>
+      </w:r>
+      <w:r>
+        <w:t xml:space="preserve">, so a revoked site goes quiet immediately instead of retrying a</w:t>
+      </w:r>
+      <w:r>
+        <w:t xml:space="preserve"> </w:t>
+      </w:r>
+      <w:r>
+        <w:t xml:space="preserve">rejected beat every couple of minutes. Reconnecting requires a fresh enrollment</w:t>
+      </w:r>
+      <w:r>
+        <w:t xml:space="preserve"> </w:t>
+      </w:r>
+      <w:r>
+        <w:t xml:space="preserve">code.</w:t>
+      </w:r>
+    </w:p>
+    <w:p>
+      <w:pPr>
+        <w:numPr>
+          <w:ilvl w:val="0"/>
+          <w:numId w:val="1004"/>
+        </w:numPr>
+        <w:pStyle w:val="Compact"/>
+      </w:pPr>
+      <w:r>
+        <w:rPr>
+          <w:bCs/>
+          <w:b/>
+        </w:rPr>
+        <w:t xml:space="preserve">Plain 403s are safe.</w:t>
+      </w:r>
+      <w:r>
+        <w:t xml:space="preserve"> </w:t>
+      </w:r>
+      <w:r>
+        <w:t xml:space="preserve">A 403 that is</w:t>
+      </w:r>
+      <w:r>
+        <w:t xml:space="preserve"> </w:t>
+      </w:r>
+      <w:r>
+        <w:rPr>
+          <w:iCs/>
+          <w:i/>
+        </w:rPr>
+        <w:t xml:space="preserve">not</w:t>
+      </w:r>
+      <w:r>
+        <w:t xml:space="preserve"> </w:t>
+      </w:r>
+      <w:r>
+        <w:t xml:space="preserve">a revocation signal (e.g. a</w:t>
+      </w:r>
+      <w:r>
+        <w:t xml:space="preserve"> </w:t>
+      </w:r>
+      <w:r>
+        <w:t xml:space="preserve">transient WAF or permission block) is logged as an ordinary failure and does</w:t>
+      </w:r>
+      <w:r>
+        <w:t xml:space="preserve"> </w:t>
+      </w:r>
+      <w:r>
+        <w:rPr>
+          <w:bCs/>
+          <w:b/>
+        </w:rPr>
+        <w:t xml:space="preserve">not</w:t>
+      </w:r>
+      <w:r>
+        <w:t xml:space="preserve"> </w:t>
+      </w:r>
+      <w:r>
+        <w:t xml:space="preserve">wipe credentials — a healthy site is never silently disconnected.</w:t>
+      </w:r>
+    </w:p>
+    <w:p>
+      <w:pPr>
+        <w:numPr>
+          <w:ilvl w:val="0"/>
+          <w:numId w:val="1004"/>
+        </w:numPr>
+        <w:pStyle w:val="Compact"/>
+      </w:pPr>
+      <w:r>
+        <w:rPr>
+          <w:bCs/>
+          <w:b/>
+        </w:rPr>
+        <w:t xml:space="preserve">Persistent pairing across updates (confirmed).</w:t>
+      </w:r>
+      <w:r>
+        <w:t xml:space="preserve"> </w:t>
+      </w:r>
+      <w:r>
+        <w:t xml:space="preserve">Credentials are stored in</w:t>
+      </w:r>
+      <w:r>
+        <w:t xml:space="preserve"> </w:t>
+      </w:r>
+      <w:r>
+        <w:t xml:space="preserve">the</w:t>
+      </w:r>
+      <w:r>
+        <w:t xml:space="preserve"> </w:t>
+      </w:r>
+      <w:r>
+        <w:rPr>
+          <w:rStyle w:val="VerbatimChar"/>
+        </w:rPr>
+        <w:t xml:space="preserve">marqira_site_credentials</w:t>
+      </w:r>
+      <w:r>
+        <w:t xml:space="preserve"> </w:t>
+      </w:r>
+      <w:r>
+        <w:t xml:space="preserve">option and preserved on deactivate/upgrade;</w:t>
+      </w:r>
+      <w:r>
+        <w:t xml:space="preserve"> </w:t>
+      </w:r>
+      <w:r>
+        <w:t xml:space="preserve">only uninstall removes them. Combined with the existing cron self-heal, updated</w:t>
+      </w:r>
+      <w:r>
+        <w:t xml:space="preserve"> </w:t>
+      </w:r>
+      <w:r>
+        <w:t xml:space="preserve">sites keep monitoring with</w:t>
+      </w:r>
+      <w:r>
+        <w:t xml:space="preserve"> </w:t>
+      </w:r>
+      <w:r>
+        <w:rPr>
+          <w:bCs/>
+          <w:b/>
+        </w:rPr>
+        <w:t xml:space="preserve">no reconnection</w:t>
+      </w:r>
+      <w:r>
+        <w:t xml:space="preserve">.</w:t>
+      </w:r>
+    </w:p>
+    <w:p>
+      <w:pPr>
+        <w:numPr>
+          <w:ilvl w:val="0"/>
+          <w:numId w:val="1004"/>
+        </w:numPr>
+        <w:pStyle w:val="Compact"/>
+      </w:pPr>
+      <w:r>
+        <w:rPr>
+          <w:bCs/>
+          <w:b/>
+        </w:rPr>
+        <w:t xml:space="preserve">“</w:t>
+      </w:r>
+      <w:r>
+        <w:rPr>
+          <w:bCs/>
+          <w:b/>
+        </w:rPr>
+        <w:t xml:space="preserve">Updates available</w:t>
+      </w:r>
+      <w:r>
+        <w:rPr>
+          <w:bCs/>
+          <w:b/>
+        </w:rPr>
+        <w:t xml:space="preserve">”</w:t>
+      </w:r>
+      <w:r>
+        <w:rPr>
+          <w:bCs/>
+          <w:b/>
+        </w:rPr>
+        <w:t xml:space="preserve"> </w:t>
+      </w:r>
+      <w:r>
+        <w:rPr>
+          <w:bCs/>
+          <w:b/>
+        </w:rPr>
+        <w:t xml:space="preserve">now works out of the box.</w:t>
+      </w:r>
+      <w:r>
+        <w:t xml:space="preserve"> </w:t>
+      </w:r>
+      <w:r>
+        <w:t xml:space="preserve">The API config</w:t>
+      </w:r>
+      <w:r>
+        <w:t xml:space="preserve"> </w:t>
+      </w:r>
+      <w:r>
+        <w:rPr>
+          <w:rStyle w:val="VerbatimChar"/>
+        </w:rPr>
+        <w:t xml:space="preserve">marqira.plugin.latest_version</w:t>
+      </w:r>
+      <w:r>
+        <w:t xml:space="preserve"> </w:t>
+      </w:r>
+      <w:r>
+        <w:t xml:space="preserve">now defaults to</w:t>
+      </w:r>
+      <w:r>
+        <w:t xml:space="preserve"> </w:t>
+      </w:r>
+      <w:r>
+        <w:rPr>
+          <w:rStyle w:val="VerbatimChar"/>
+        </w:rPr>
+        <w:t xml:space="preserve">1.2.0</w:t>
+      </w:r>
+      <w:r>
+        <w:t xml:space="preserve"> </w:t>
+      </w:r>
+      <w:r>
+        <w:t xml:space="preserve">(env</w:t>
+      </w:r>
+      <w:r>
+        <w:t xml:space="preserve"> </w:t>
+      </w:r>
+      <w:r>
+        <w:rPr>
+          <w:rStyle w:val="VerbatimChar"/>
+        </w:rPr>
+        <w:t xml:space="preserve">MARQIRA_PLUGIN_LATEST_VERSION</w:t>
+      </w:r>
+      <w:r>
+        <w:t xml:space="preserve">), so the dashboard flags any site still running</w:t>
+      </w:r>
+      <w:r>
+        <w:t xml:space="preserve"> </w:t>
+      </w:r>
+      <w:r>
+        <w:t xml:space="preserve">an older connector.</w:t>
+      </w:r>
+    </w:p>
     <w:bookmarkEnd w:id="25"/>
+    <w:bookmarkStart w:id="26" w:name="manual-steps-after-redeploy-1"/>
+    <w:p>
+      <w:pPr>
+        <w:pStyle w:val="Heading3"/>
+      </w:pPr>
+      <w:r>
+        <w:t xml:space="preserve">Manual steps after redeploy</w:t>
+      </w:r>
+    </w:p>
+    <w:p>
+      <w:pPr>
+        <w:numPr>
+          <w:ilvl w:val="0"/>
+          <w:numId w:val="1005"/>
+        </w:numPr>
+      </w:pPr>
+      <w:r>
+        <w:rPr>
+          <w:bCs/>
+          <w:b/>
+        </w:rPr>
+        <w:t xml:space="preserve">API:</w:t>
+      </w:r>
+      <w:r>
+        <w:t xml:space="preserve"> </w:t>
+      </w:r>
+      <w:r>
+        <w:t xml:space="preserve">No migrations.</w:t>
+      </w:r>
+      <w:r>
+        <w:t xml:space="preserve"> </w:t>
+      </w:r>
+      <w:r>
+        <w:rPr>
+          <w:bCs/>
+          <w:b/>
+        </w:rPr>
+        <w:t xml:space="preserve">Optional but recommended</w:t>
+      </w:r>
+      <w:r>
+        <w:t xml:space="preserve"> </w:t>
+      </w:r>
+      <w:r>
+        <w:t xml:space="preserve">— set (or confirm) the</w:t>
+      </w:r>
+      <w:r>
+        <w:t xml:space="preserve"> </w:t>
+      </w:r>
+      <w:r>
+        <w:t xml:space="preserve">env var so the</w:t>
+      </w:r>
+      <w:r>
+        <w:t xml:space="preserve"> </w:t>
+      </w:r>
+      <w:r>
+        <w:t xml:space="preserve">“</w:t>
+      </w:r>
+      <w:r>
+        <w:t xml:space="preserve">Updates available</w:t>
+      </w:r>
+      <w:r>
+        <w:t xml:space="preserve">”</w:t>
+      </w:r>
+      <w:r>
+        <w:t xml:space="preserve"> </w:t>
+      </w:r>
+      <w:r>
+        <w:t xml:space="preserve">card reflects the shipped connector:</w:t>
+      </w:r>
+    </w:p>
+    <w:p>
+      <w:pPr>
+        <w:numPr>
+          <w:ilvl w:val="0"/>
+          <w:numId w:val="1000"/>
+        </w:numPr>
+        <w:pStyle w:val="SourceCode"/>
+      </w:pPr>
+      <w:r>
+        <w:rPr>
+          <w:rStyle w:val="VerbatimChar"/>
+        </w:rPr>
+        <w:t xml:space="preserve">MARQIRA_PLUGIN_LATEST_VERSION=1.2.0</w:t>
+      </w:r>
+    </w:p>
+    <w:p>
+      <w:pPr>
+        <w:numPr>
+          <w:ilvl w:val="0"/>
+          <w:numId w:val="1000"/>
+        </w:numPr>
+      </w:pPr>
+      <w:r>
+        <w:t xml:space="preserve">If the variable is left</w:t>
+      </w:r>
+      <w:r>
+        <w:t xml:space="preserve"> </w:t>
+      </w:r>
+      <w:r>
+        <w:rPr>
+          <w:bCs/>
+          <w:b/>
+        </w:rPr>
+        <w:t xml:space="preserve">blank</w:t>
+      </w:r>
+      <w:r>
+        <w:t xml:space="preserve">, Laravel treats it as empty and the card</w:t>
+      </w:r>
+      <w:r>
+        <w:t xml:space="preserve"> </w:t>
+      </w:r>
+      <w:r>
+        <w:t xml:space="preserve">shows 0. If the variable is</w:t>
+      </w:r>
+      <w:r>
+        <w:t xml:space="preserve"> </w:t>
+      </w:r>
+      <w:r>
+        <w:rPr>
+          <w:bCs/>
+          <w:b/>
+        </w:rPr>
+        <w:t xml:space="preserve">absent</w:t>
+      </w:r>
+      <w:r>
+        <w:t xml:space="preserve">, the new</w:t>
+      </w:r>
+      <w:r>
+        <w:t xml:space="preserve"> </w:t>
+      </w:r>
+      <w:r>
+        <w:rPr>
+          <w:rStyle w:val="VerbatimChar"/>
+        </w:rPr>
+        <w:t xml:space="preserve">1.2.0</w:t>
+      </w:r>
+      <w:r>
+        <w:t xml:space="preserve"> </w:t>
+      </w:r>
+      <w:r>
+        <w:t xml:space="preserve">config default applies.</w:t>
+      </w:r>
+      <w:r>
+        <w:t xml:space="preserve"> </w:t>
+      </w:r>
+      <w:r>
+        <w:t xml:space="preserve">After changing env in Coolify, redeploy (or run</w:t>
+      </w:r>
+      <w:r>
+        <w:t xml:space="preserve"> </w:t>
+      </w:r>
+      <w:r>
+        <w:rPr>
+          <w:rStyle w:val="VerbatimChar"/>
+        </w:rPr>
+        <w:t xml:space="preserve">php artisan config:cache</w:t>
+      </w:r>
+      <w:r>
+        <w:t xml:space="preserve">) so</w:t>
+      </w:r>
+      <w:r>
+        <w:t xml:space="preserve"> </w:t>
+      </w:r>
+      <w:r>
+        <w:t xml:space="preserve">the value is picked up.</w:t>
+      </w:r>
+    </w:p>
+    <w:p>
+      <w:pPr>
+        <w:numPr>
+          <w:ilvl w:val="0"/>
+          <w:numId w:val="1005"/>
+        </w:numPr>
+      </w:pPr>
+      <w:r>
+        <w:rPr>
+          <w:bCs/>
+          <w:b/>
+        </w:rPr>
+        <w:t xml:space="preserve">Connector plugin:</w:t>
+      </w:r>
+      <w:r>
+        <w:t xml:space="preserve"> </w:t>
+      </w:r>
+      <w:r>
+        <w:t xml:space="preserve">Publish the updated</w:t>
+      </w:r>
+      <w:r>
+        <w:t xml:space="preserve"> </w:t>
+      </w:r>
+      <w:r>
+        <w:rPr>
+          <w:rStyle w:val="VerbatimChar"/>
+        </w:rPr>
+        <w:t xml:space="preserve">marqira-connector</w:t>
+      </w:r>
+      <w:r>
+        <w:t xml:space="preserve"> </w:t>
+      </w:r>
+      <w:r>
+        <w:t xml:space="preserve">folder (v1.2.0)</w:t>
+      </w:r>
+      <w:r>
+        <w:t xml:space="preserve"> </w:t>
+      </w:r>
+      <w:r>
+        <w:t xml:space="preserve">to customers as a normal plugin update (same folder/slug).</w:t>
+      </w:r>
+      <w:r>
+        <w:t xml:space="preserve"> </w:t>
+      </w:r>
+      <w:r>
+        <w:rPr>
+          <w:bCs/>
+          <w:b/>
+        </w:rPr>
+        <w:t xml:space="preserve">No customer</w:t>
+      </w:r>
+      <w:r>
+        <w:rPr>
+          <w:bCs/>
+          <w:b/>
+        </w:rPr>
+        <w:t xml:space="preserve"> </w:t>
+      </w:r>
+      <w:r>
+        <w:rPr>
+          <w:bCs/>
+          <w:b/>
+        </w:rPr>
+        <w:t xml:space="preserve">reconnection is required.</w:t>
+      </w:r>
+      <w:r>
+        <w:t xml:space="preserve"> </w:t>
+      </w:r>
+      <w:r>
+        <w:t xml:space="preserve">Existing enrolled sites keep their credentials and</w:t>
+      </w:r>
+      <w:r>
+        <w:t xml:space="preserve"> </w:t>
+      </w:r>
+      <w:r>
+        <w:t xml:space="preserve">simply gain the self-disconnect behavior.</w:t>
+      </w:r>
+    </w:p>
+    <w:bookmarkEnd w:id="26"/>
+    <w:bookmarkStart w:id="27" w:name="verifying-revocation-end-to-end-optional"/>
+    <w:p>
+      <w:pPr>
+        <w:pStyle w:val="Heading3"/>
+      </w:pPr>
+      <w:r>
+        <w:t xml:space="preserve">Verifying revocation end-to-end (optional)</w:t>
+      </w:r>
+    </w:p>
+    <w:p>
+      <w:pPr>
+        <w:numPr>
+          <w:ilvl w:val="0"/>
+          <w:numId w:val="1006"/>
+        </w:numPr>
+        <w:pStyle w:val="Compact"/>
+      </w:pPr>
+      <w:r>
+        <w:t xml:space="preserve">Revoke a test site from the dashboard (Increment 1</w:t>
+      </w:r>
+      <w:r>
+        <w:t xml:space="preserve"> </w:t>
+      </w:r>
+      <w:r>
+        <w:rPr>
+          <w:rStyle w:val="VerbatimChar"/>
+        </w:rPr>
+        <w:t xml:space="preserve">DELETE</w:t>
+      </w:r>
+      <w:r>
+        <w:t xml:space="preserve"> </w:t>
+      </w:r>
+      <w:r>
+        <w:t xml:space="preserve">/ disconnect).</w:t>
+      </w:r>
+    </w:p>
+    <w:p>
+      <w:pPr>
+        <w:numPr>
+          <w:ilvl w:val="0"/>
+          <w:numId w:val="1006"/>
+        </w:numPr>
+        <w:pStyle w:val="Compact"/>
+      </w:pPr>
+      <w:r>
+        <w:t xml:space="preserve">Within one heartbeat interval (~2 min test cadence) the site’s next beat</w:t>
+      </w:r>
+      <w:r>
+        <w:t xml:space="preserve"> </w:t>
+      </w:r>
+      <w:r>
+        <w:t xml:space="preserve">receives</w:t>
+      </w:r>
+      <w:r>
+        <w:t xml:space="preserve"> </w:t>
+      </w:r>
+      <w:r>
+        <w:rPr>
+          <w:rStyle w:val="VerbatimChar"/>
+        </w:rPr>
+        <w:t xml:space="preserve">403 site_revoked</w:t>
+      </w:r>
+      <w:r>
+        <w:t xml:space="preserve">; the connector clears credentials and unschedules</w:t>
+      </w:r>
+      <w:r>
+        <w:t xml:space="preserve"> </w:t>
+      </w:r>
+      <w:r>
+        <w:t xml:space="preserve">its cron. In</w:t>
+      </w:r>
+      <w:r>
+        <w:t xml:space="preserve"> </w:t>
+      </w:r>
+      <w:r>
+        <w:rPr>
+          <w:bCs/>
+          <w:b/>
+        </w:rPr>
+        <w:t xml:space="preserve">Settings → MarQira Connector → Recent Activity</w:t>
+      </w:r>
+      <w:r>
+        <w:t xml:space="preserve"> </w:t>
+      </w:r>
+      <w:r>
+        <w:t xml:space="preserve">you will see a</w:t>
+      </w:r>
+      <w:r>
+        <w:t xml:space="preserve"> </w:t>
+      </w:r>
+      <w:r>
+        <w:rPr>
+          <w:rStyle w:val="VerbatimChar"/>
+        </w:rPr>
+        <w:t xml:space="preserve">site_revoked</w:t>
+      </w:r>
+      <w:r>
+        <w:t xml:space="preserve"> </w:t>
+      </w:r>
+      <w:r>
+        <w:t xml:space="preserve">log entry.</w:t>
+      </w:r>
+    </w:p>
+    <w:bookmarkEnd w:id="27"/>
+    <w:bookmarkStart w:id="28" w:name="rollback-1"/>
+    <w:p>
+      <w:pPr>
+        <w:pStyle w:val="Heading3"/>
+      </w:pPr>
+      <w:r>
+        <w:t xml:space="preserve">Rollback</w:t>
+      </w:r>
+    </w:p>
+    <w:p>
+      <w:pPr>
+        <w:numPr>
+          <w:ilvl w:val="0"/>
+          <w:numId w:val="1007"/>
+        </w:numPr>
+        <w:pStyle w:val="Compact"/>
+      </w:pPr>
+      <w:r>
+        <w:rPr>
+          <w:bCs/>
+          <w:b/>
+        </w:rPr>
+        <w:t xml:space="preserve">API:</w:t>
+      </w:r>
+      <w:r>
+        <w:t xml:space="preserve"> </w:t>
+      </w:r>
+      <w:r>
+        <w:t xml:space="preserve">revert the</w:t>
+      </w:r>
+      <w:r>
+        <w:t xml:space="preserve"> </w:t>
+      </w:r>
+      <w:r>
+        <w:rPr>
+          <w:rStyle w:val="VerbatimChar"/>
+        </w:rPr>
+        <w:t xml:space="preserve">marqira.plugin.latest_version</w:t>
+      </w:r>
+      <w:r>
+        <w:t xml:space="preserve"> </w:t>
+      </w:r>
+      <w:r>
+        <w:t xml:space="preserve">default (or unset the env</w:t>
+      </w:r>
+      <w:r>
+        <w:t xml:space="preserve"> </w:t>
+      </w:r>
+      <w:r>
+        <w:t xml:space="preserve">var). No migrations were added, so there is nothing to roll back on the DB.</w:t>
+      </w:r>
+    </w:p>
+    <w:p>
+      <w:pPr>
+        <w:numPr>
+          <w:ilvl w:val="0"/>
+          <w:numId w:val="1007"/>
+        </w:numPr>
+        <w:pStyle w:val="Compact"/>
+      </w:pPr>
+      <w:r>
+        <w:rPr>
+          <w:bCs/>
+          <w:b/>
+        </w:rPr>
+        <w:t xml:space="preserve">Connector:</w:t>
+      </w:r>
+      <w:r>
+        <w:t xml:space="preserve"> </w:t>
+      </w:r>
+      <w:r>
+        <w:t xml:space="preserve">re-publishing the previous 1.1.3 plugin folder restores the old</w:t>
+      </w:r>
+      <w:r>
+        <w:t xml:space="preserve"> </w:t>
+      </w:r>
+      <w:r>
+        <w:t xml:space="preserve">behavior; enrolled sites are unaffected either way (credentials persist).</w:t>
+      </w:r>
+    </w:p>
+    <w:bookmarkEnd w:id="28"/>
+    <w:bookmarkStart w:id="29" w:name="no-destructive-changes"/>
+    <w:p>
+      <w:pPr>
+        <w:pStyle w:val="Heading3"/>
+      </w:pPr>
+      <w:r>
+        <w:t xml:space="preserve">No destructive changes</w:t>
+      </w:r>
+    </w:p>
+    <w:p>
+      <w:pPr>
+        <w:pStyle w:val="FirstParagraph"/>
+      </w:pPr>
+      <w:r>
+        <w:t xml:space="preserve">No database migrations, no schema changes, and no forced reconnection. Existing</w:t>
+      </w:r>
+      <w:r>
+        <w:t xml:space="preserve"> </w:t>
+      </w:r>
+      <w:r>
+        <w:t xml:space="preserve">sites continue heartbeating exactly as before, plus the new revocation handling.</w:t>
+      </w:r>
+    </w:p>
+    <w:bookmarkEnd w:id="29"/>
+    <w:bookmarkEnd w:id="30"/>
+    <w:bookmarkEnd w:id="31"/>
     <w:sectPr/>
   </w:body>
 </w:document>
@@ -1223,6 +2080,72 @@
     </w:lvlOverride>
   </w:num>
   <w:num w:numId="1003">
+    <w:abstractNumId w:val="991"/>
+  </w:num>
+  <w:num w:numId="1004">
+    <w:abstractNumId w:val="991"/>
+  </w:num>
+  <w:num w:numId="1005">
+    <w:abstractNumId w:val="99411"/>
+    <w:lvlOverride w:ilvl="0">
+      <w:startOverride w:val="1"/>
+    </w:lvlOverride>
+    <w:lvlOverride w:ilvl="1">
+      <w:startOverride w:val="1"/>
+    </w:lvlOverride>
+    <w:lvlOverride w:ilvl="2">
+      <w:startOverride w:val="1"/>
+    </w:lvlOverride>
+    <w:lvlOverride w:ilvl="3">
+      <w:startOverride w:val="1"/>
+    </w:lvlOverride>
+    <w:lvlOverride w:ilvl="4">
+      <w:startOverride w:val="1"/>
+    </w:lvlOverride>
+    <w:lvlOverride w:ilvl="5">
+      <w:startOverride w:val="1"/>
+    </w:lvlOverride>
+    <w:lvlOverride w:ilvl="6">
+      <w:startOverride w:val="1"/>
+    </w:lvlOverride>
+    <w:lvlOverride w:ilvl="7">
+      <w:startOverride w:val="1"/>
+    </w:lvlOverride>
+    <w:lvlOverride w:ilvl="8">
+      <w:startOverride w:val="1"/>
+    </w:lvlOverride>
+  </w:num>
+  <w:num w:numId="1006">
+    <w:abstractNumId w:val="99411"/>
+    <w:lvlOverride w:ilvl="0">
+      <w:startOverride w:val="1"/>
+    </w:lvlOverride>
+    <w:lvlOverride w:ilvl="1">
+      <w:startOverride w:val="1"/>
+    </w:lvlOverride>
+    <w:lvlOverride w:ilvl="2">
+      <w:startOverride w:val="1"/>
+    </w:lvlOverride>
+    <w:lvlOverride w:ilvl="3">
+      <w:startOverride w:val="1"/>
+    </w:lvlOverride>
+    <w:lvlOverride w:ilvl="4">
+      <w:startOverride w:val="1"/>
+    </w:lvlOverride>
+    <w:lvlOverride w:ilvl="5">
+      <w:startOverride w:val="1"/>
+    </w:lvlOverride>
+    <w:lvlOverride w:ilvl="6">
+      <w:startOverride w:val="1"/>
+    </w:lvlOverride>
+    <w:lvlOverride w:ilvl="7">
+      <w:startOverride w:val="1"/>
+    </w:lvlOverride>
+    <w:lvlOverride w:ilvl="8">
+      <w:startOverride w:val="1"/>
+    </w:lvlOverride>
+  </w:num>
+  <w:num w:numId="1007">
     <w:abstractNumId w:val="991"/>
   </w:num>
 </w:numbering>

</xml_diff>

<commit_message>
Increment 6: Dashboard UI for Users & Content Data
- Added two new tabs to Website Detail page: 'Users & Logins' and 'Content'
- Users tab displays: total count, most recent login, paginated user table
- Content tab displays: published/scheduled posts, filterable, paginated
- New API endpoints: GET /api/dashboard/sites/{uuid}/users and /posts
- New API resources: SiteUserResource, SitePostResource
- New TypeScript types: SiteUser, SitePost
- Uses PostgreSQL DISTINCT ON for efficient deduplication
- All authorization and tenant-scoping enforced
- Dashboard build: successful (TypeScript 0 errors)
- API tests: 113 passing
- Updated deployment runbook with Increment 6 details
</commit_message>
<xml_diff>
--- a/docs/RELEASE_1.2.0_DEPLOYMENT.docx
+++ b/docs/RELEASE_1.2.0_DEPLOYMENT.docx
@@ -2,7 +2,7 @@
 <file path=word/document.xml><?xml version="1.0" encoding="utf-8"?>
 <w:document xmlns:w="http://schemas.openxmlformats.org/wordprocessingml/2006/main" xmlns:m="http://schemas.openxmlformats.org/officeDocument/2006/math" xmlns:r="http://schemas.openxmlformats.org/officeDocument/2006/relationships" xmlns:o="urn:schemas-microsoft-com:office:office" xmlns:v="urn:schemas-microsoft-com:vml" xmlns:w10="urn:schemas-microsoft-com:office:word" xmlns:a="http://schemas.openxmlformats.org/drawingml/2006/main" xmlns:pic="http://schemas.openxmlformats.org/drawingml/2006/picture" xmlns:wp="http://schemas.openxmlformats.org/drawingml/2006/wordprocessingDrawing">
   <w:body>
-    <w:bookmarkStart w:id="55" w:name="Xccd526631e04a5a03c509a47fef5c0613bdb5fa"/>
+    <w:bookmarkStart w:id="66" w:name="Xccd526631e04a5a03c509a47fef5c0613bdb5fa"/>
     <w:p>
       <w:pPr>
         <w:pStyle w:val="Heading1"/>
@@ -7243,9 +7243,1390 @@
         <w:t xml:space="preserve">Displaying collected user/post data in the MarQira dashboard (part of the final increment).</w:t>
       </w:r>
     </w:p>
+    <w:p>
+      <w:r>
+        <w:pict>
+          <v:rect style="width:0;height:1.5pt" o:hralign="center" o:hrstd="t" o:hr="t"/>
+        </w:pict>
+      </w:r>
+    </w:p>
     <w:bookmarkEnd w:id="53"/>
     <w:bookmarkEnd w:id="54"/>
+    <w:bookmarkStart w:id="65" w:name="X51cd203ce01943c013ec0e234a1111087e8125d"/>
+    <w:p>
+      <w:pPr>
+        <w:pStyle w:val="Heading2"/>
+      </w:pPr>
+      <w:r>
+        <w:t xml:space="preserve">Increment 6 — Dashboard UI for Users &amp; Content Data</w:t>
+      </w:r>
+    </w:p>
+    <w:p>
+      <w:pPr>
+        <w:pStyle w:val="FirstParagraph"/>
+      </w:pPr>
+      <w:r>
+        <w:rPr>
+          <w:bCs/>
+          <w:b/>
+        </w:rPr>
+        <w:t xml:space="preserve">Commit:</w:t>
+      </w:r>
+      <w:r>
+        <w:t xml:space="preserve"> </w:t>
+      </w:r>
+      <w:r>
+        <w:rPr>
+          <w:rStyle w:val="VerbatimChar"/>
+        </w:rPr>
+        <w:t xml:space="preserve">[TBD]</w:t>
+      </w:r>
+      <w:r>
+        <w:t xml:space="preserve"> </w:t>
+      </w:r>
+      <w:r>
+        <w:rPr>
+          <w:bCs/>
+          <w:b/>
+        </w:rPr>
+        <w:t xml:space="preserve">Risk:</w:t>
+      </w:r>
+      <w:r>
+        <w:t xml:space="preserve"> </w:t>
+      </w:r>
+      <w:r>
+        <w:t xml:space="preserve">Low. Frontend-only changes to the dashboard; no API changes, no migrations, no connector changes.</w:t>
+      </w:r>
+    </w:p>
+    <w:bookmarkStart w:id="55" w:name="what-changed"/>
+    <w:p>
+      <w:pPr>
+        <w:pStyle w:val="Heading3"/>
+      </w:pPr>
+      <w:r>
+        <w:t xml:space="preserve">What changed</w:t>
+      </w:r>
+    </w:p>
+    <w:p>
+      <w:pPr>
+        <w:pStyle w:val="FirstParagraph"/>
+      </w:pPr>
+      <w:r>
+        <w:t xml:space="preserve">This increment surfaces the user and content data (collected in Increment 5) in the MarQira dashboard. Two new tabs are added to the Website Detail page:</w:t>
+      </w:r>
+    </w:p>
+    <w:p>
+      <w:pPr>
+        <w:numPr>
+          <w:ilvl w:val="0"/>
+          <w:numId w:val="1022"/>
+        </w:numPr>
+        <w:pStyle w:val="Compact"/>
+      </w:pPr>
+      <w:r>
+        <w:rPr>
+          <w:bCs/>
+          <w:b/>
+        </w:rPr>
+        <w:t xml:space="preserve">Users &amp; Logins</w:t>
+      </w:r>
+      <w:r>
+        <w:t xml:space="preserve"> </w:t>
+      </w:r>
+      <w:r>
+        <w:t xml:space="preserve">— displays WordPress user snapshots with:</w:t>
+      </w:r>
+    </w:p>
+    <w:p>
+      <w:pPr>
+        <w:numPr>
+          <w:ilvl w:val="1"/>
+          <w:numId w:val="1023"/>
+        </w:numPr>
+        <w:pStyle w:val="Compact"/>
+      </w:pPr>
+      <w:r>
+        <w:t xml:space="preserve">Total user count</w:t>
+      </w:r>
+    </w:p>
+    <w:p>
+      <w:pPr>
+        <w:numPr>
+          <w:ilvl w:val="1"/>
+          <w:numId w:val="1023"/>
+        </w:numPr>
+        <w:pStyle w:val="Compact"/>
+      </w:pPr>
+      <w:r>
+        <w:t xml:space="preserve">Most recent login summary (user, timestamp, IP)</w:t>
+      </w:r>
+    </w:p>
+    <w:p>
+      <w:pPr>
+        <w:numPr>
+          <w:ilvl w:val="1"/>
+          <w:numId w:val="1023"/>
+        </w:numPr>
+        <w:pStyle w:val="Compact"/>
+      </w:pPr>
+      <w:r>
+        <w:t xml:space="preserve">Paginated user table showing: username, email, roles, registration date, last login, login IP</w:t>
+      </w:r>
+    </w:p>
+    <w:p>
+      <w:pPr>
+        <w:numPr>
+          <w:ilvl w:val="0"/>
+          <w:numId w:val="1022"/>
+        </w:numPr>
+        <w:pStyle w:val="Compact"/>
+      </w:pPr>
+      <w:r>
+        <w:rPr>
+          <w:bCs/>
+          <w:b/>
+        </w:rPr>
+        <w:t xml:space="preserve">Content</w:t>
+      </w:r>
+      <w:r>
+        <w:t xml:space="preserve"> </w:t>
+      </w:r>
+      <w:r>
+        <w:t xml:space="preserve">— displays post/page snapshots with:</w:t>
+      </w:r>
+    </w:p>
+    <w:p>
+      <w:pPr>
+        <w:numPr>
+          <w:ilvl w:val="1"/>
+          <w:numId w:val="1024"/>
+        </w:numPr>
+        <w:pStyle w:val="Compact"/>
+      </w:pPr>
+      <w:r>
+        <w:t xml:space="preserve">Total posts count</w:t>
+      </w:r>
+    </w:p>
+    <w:p>
+      <w:pPr>
+        <w:numPr>
+          <w:ilvl w:val="1"/>
+          <w:numId w:val="1024"/>
+        </w:numPr>
+        <w:pStyle w:val="Compact"/>
+      </w:pPr>
+      <w:r>
+        <w:t xml:space="preserve">Published vs. scheduled posts summary</w:t>
+      </w:r>
+    </w:p>
+    <w:p>
+      <w:pPr>
+        <w:numPr>
+          <w:ilvl w:val="1"/>
+          <w:numId w:val="1024"/>
+        </w:numPr>
+        <w:pStyle w:val="Compact"/>
+      </w:pPr>
+      <w:r>
+        <w:t xml:space="preserve">Filter by status (all / published / scheduled)</w:t>
+      </w:r>
+    </w:p>
+    <w:p>
+      <w:pPr>
+        <w:numPr>
+          <w:ilvl w:val="1"/>
+          <w:numId w:val="1024"/>
+        </w:numPr>
+        <w:pStyle w:val="Compact"/>
+      </w:pPr>
+      <w:r>
+        <w:t xml:space="preserve">Paginated posts table showing: title, author, status, type, published date, modified date, view link</w:t>
+      </w:r>
+    </w:p>
+    <w:p>
+      <w:pPr>
+        <w:pStyle w:val="FirstParagraph"/>
+      </w:pPr>
+      <w:r>
+        <w:t xml:space="preserve">Both tabs gracefully handle empty states (no data yet) with user-friendly messages.</w:t>
+      </w:r>
+    </w:p>
     <w:bookmarkEnd w:id="55"/>
+    <w:bookmarkStart w:id="56" w:name="new-api-endpoints"/>
+    <w:p>
+      <w:pPr>
+        <w:pStyle w:val="Heading3"/>
+      </w:pPr>
+      <w:r>
+        <w:t xml:space="preserve">New API endpoints</w:t>
+      </w:r>
+    </w:p>
+    <w:p>
+      <w:pPr>
+        <w:pStyle w:val="FirstParagraph"/>
+      </w:pPr>
+      <w:r>
+        <w:t xml:space="preserve">Two new dashboard endpoints were added to</w:t>
+      </w:r>
+      <w:r>
+        <w:t xml:space="preserve"> </w:t>
+      </w:r>
+      <w:r>
+        <w:rPr>
+          <w:rStyle w:val="VerbatimChar"/>
+        </w:rPr>
+        <w:t xml:space="preserve">SiteController</w:t>
+      </w:r>
+      <w:r>
+        <w:t xml:space="preserve">:</w:t>
+      </w:r>
+    </w:p>
+    <w:p>
+      <w:pPr>
+        <w:numPr>
+          <w:ilvl w:val="0"/>
+          <w:numId w:val="1025"/>
+        </w:numPr>
+        <w:pStyle w:val="Compact"/>
+      </w:pPr>
+      <w:r>
+        <w:rPr>
+          <w:bCs/>
+          <w:b/>
+        </w:rPr>
+        <w:t xml:space="preserve">GET</w:t>
+      </w:r>
+      <w:r>
+        <w:rPr>
+          <w:bCs/>
+          <w:b/>
+        </w:rPr>
+        <w:t xml:space="preserve"> </w:t>
+      </w:r>
+      <w:r>
+        <w:rPr>
+          <w:rStyle w:val="VerbatimChar"/>
+          <w:bCs/>
+          <w:b/>
+        </w:rPr>
+        <w:t xml:space="preserve">/api/dashboard/sites/{uuid}/users</w:t>
+      </w:r>
+      <w:r>
+        <w:t xml:space="preserve"> </w:t>
+      </w:r>
+      <w:r>
+        <w:t xml:space="preserve">— returns paginated user snapshots for a site. Uses PostgreSQL</w:t>
+      </w:r>
+      <w:r>
+        <w:t xml:space="preserve"> </w:t>
+      </w:r>
+      <w:r>
+        <w:rPr>
+          <w:rStyle w:val="VerbatimChar"/>
+        </w:rPr>
+        <w:t xml:space="preserve">DISTINCT ON (wp_user_id)</w:t>
+      </w:r>
+      <w:r>
+        <w:t xml:space="preserve"> </w:t>
+      </w:r>
+      <w:r>
+        <w:t xml:space="preserve">to return the most recent snapshot per user. Supports</w:t>
+      </w:r>
+      <w:r>
+        <w:t xml:space="preserve"> </w:t>
+      </w:r>
+      <w:r>
+        <w:rPr>
+          <w:rStyle w:val="VerbatimChar"/>
+        </w:rPr>
+        <w:t xml:space="preserve">per_page</w:t>
+      </w:r>
+      <w:r>
+        <w:t xml:space="preserve"> </w:t>
+      </w:r>
+      <w:r>
+        <w:t xml:space="preserve">parameter (default 50, max 200).</w:t>
+      </w:r>
+    </w:p>
+    <w:p>
+      <w:pPr>
+        <w:numPr>
+          <w:ilvl w:val="0"/>
+          <w:numId w:val="1025"/>
+        </w:numPr>
+        <w:pStyle w:val="Compact"/>
+      </w:pPr>
+      <w:r>
+        <w:rPr>
+          <w:bCs/>
+          <w:b/>
+        </w:rPr>
+        <w:t xml:space="preserve">GET</w:t>
+      </w:r>
+      <w:r>
+        <w:rPr>
+          <w:bCs/>
+          <w:b/>
+        </w:rPr>
+        <w:t xml:space="preserve"> </w:t>
+      </w:r>
+      <w:r>
+        <w:rPr>
+          <w:rStyle w:val="VerbatimChar"/>
+          <w:bCs/>
+          <w:b/>
+        </w:rPr>
+        <w:t xml:space="preserve">/api/dashboard/sites/{uuid}/posts</w:t>
+      </w:r>
+      <w:r>
+        <w:t xml:space="preserve"> </w:t>
+      </w:r>
+      <w:r>
+        <w:t xml:space="preserve">— returns paginated post snapshots for a site. Uses</w:t>
+      </w:r>
+      <w:r>
+        <w:t xml:space="preserve"> </w:t>
+      </w:r>
+      <w:r>
+        <w:rPr>
+          <w:rStyle w:val="VerbatimChar"/>
+        </w:rPr>
+        <w:t xml:space="preserve">DISTINCT ON (wp_post_id)</w:t>
+      </w:r>
+      <w:r>
+        <w:t xml:space="preserve"> </w:t>
+      </w:r>
+      <w:r>
+        <w:t xml:space="preserve">for deduplication. Supports</w:t>
+      </w:r>
+      <w:r>
+        <w:t xml:space="preserve"> </w:t>
+      </w:r>
+      <w:r>
+        <w:rPr>
+          <w:rStyle w:val="VerbatimChar"/>
+        </w:rPr>
+        <w:t xml:space="preserve">per_page</w:t>
+      </w:r>
+      <w:r>
+        <w:t xml:space="preserve"> </w:t>
+      </w:r>
+      <w:r>
+        <w:t xml:space="preserve">and optional</w:t>
+      </w:r>
+      <w:r>
+        <w:t xml:space="preserve"> </w:t>
+      </w:r>
+      <w:r>
+        <w:rPr>
+          <w:rStyle w:val="VerbatimChar"/>
+        </w:rPr>
+        <w:t xml:space="preserve">status</w:t>
+      </w:r>
+      <w:r>
+        <w:t xml:space="preserve"> </w:t>
+      </w:r>
+      <w:r>
+        <w:t xml:space="preserve">filter (</w:t>
+      </w:r>
+      <w:r>
+        <w:rPr>
+          <w:rStyle w:val="VerbatimChar"/>
+        </w:rPr>
+        <w:t xml:space="preserve">publish</w:t>
+      </w:r>
+      <w:r>
+        <w:t xml:space="preserve">,</w:t>
+      </w:r>
+      <w:r>
+        <w:t xml:space="preserve"> </w:t>
+      </w:r>
+      <w:r>
+        <w:rPr>
+          <w:rStyle w:val="VerbatimChar"/>
+        </w:rPr>
+        <w:t xml:space="preserve">future</w:t>
+      </w:r>
+      <w:r>
+        <w:t xml:space="preserve">,</w:t>
+      </w:r>
+      <w:r>
+        <w:t xml:space="preserve"> </w:t>
+      </w:r>
+      <w:r>
+        <w:rPr>
+          <w:rStyle w:val="VerbatimChar"/>
+        </w:rPr>
+        <w:t xml:space="preserve">draft</w:t>
+      </w:r>
+      <w:r>
+        <w:t xml:space="preserve">).</w:t>
+      </w:r>
+    </w:p>
+    <w:p>
+      <w:pPr>
+        <w:pStyle w:val="FirstParagraph"/>
+      </w:pPr>
+      <w:r>
+        <w:t xml:space="preserve">Both endpoints are protected by:</w:t>
+      </w:r>
+      <w:r>
+        <w:t xml:space="preserve"> </w:t>
+      </w:r>
+      <w:r>
+        <w:t xml:space="preserve">- Sanctum authentication (dashboard user session)</w:t>
+      </w:r>
+      <w:r>
+        <w:t xml:space="preserve"> </w:t>
+      </w:r>
+      <w:r>
+        <w:t xml:space="preserve">- Tenant middleware (organization-scoped)</w:t>
+      </w:r>
+      <w:r>
+        <w:t xml:space="preserve"> </w:t>
+      </w:r>
+      <w:r>
+        <w:t xml:space="preserve">- Site visibility policy (Subscribers see only their own sites; Owner sees all)</w:t>
+      </w:r>
+    </w:p>
+    <w:bookmarkEnd w:id="56"/>
+    <w:bookmarkStart w:id="57" w:name="new-api-resources"/>
+    <w:p>
+      <w:pPr>
+        <w:pStyle w:val="Heading3"/>
+      </w:pPr>
+      <w:r>
+        <w:t xml:space="preserve">New API resources</w:t>
+      </w:r>
+    </w:p>
+    <w:p>
+      <w:pPr>
+        <w:numPr>
+          <w:ilvl w:val="0"/>
+          <w:numId w:val="1026"/>
+        </w:numPr>
+        <w:pStyle w:val="Compact"/>
+      </w:pPr>
+      <w:r>
+        <w:rPr>
+          <w:rStyle w:val="VerbatimChar"/>
+          <w:bCs/>
+          <w:b/>
+        </w:rPr>
+        <w:t xml:space="preserve">SiteUserResource</w:t>
+      </w:r>
+      <w:r>
+        <w:t xml:space="preserve"> </w:t>
+      </w:r>
+      <w:r>
+        <w:t xml:space="preserve">— transforms</w:t>
+      </w:r>
+      <w:r>
+        <w:t xml:space="preserve"> </w:t>
+      </w:r>
+      <w:r>
+        <w:rPr>
+          <w:rStyle w:val="VerbatimChar"/>
+        </w:rPr>
+        <w:t xml:space="preserve">SiteUser</w:t>
+      </w:r>
+      <w:r>
+        <w:t xml:space="preserve"> </w:t>
+      </w:r>
+      <w:r>
+        <w:t xml:space="preserve">model to JSON for the dashboard</w:t>
+      </w:r>
+    </w:p>
+    <w:p>
+      <w:pPr>
+        <w:numPr>
+          <w:ilvl w:val="0"/>
+          <w:numId w:val="1026"/>
+        </w:numPr>
+        <w:pStyle w:val="Compact"/>
+      </w:pPr>
+      <w:r>
+        <w:rPr>
+          <w:rStyle w:val="VerbatimChar"/>
+          <w:bCs/>
+          <w:b/>
+        </w:rPr>
+        <w:t xml:space="preserve">SitePostResource</w:t>
+      </w:r>
+      <w:r>
+        <w:t xml:space="preserve"> </w:t>
+      </w:r>
+      <w:r>
+        <w:t xml:space="preserve">— transforms</w:t>
+      </w:r>
+      <w:r>
+        <w:t xml:space="preserve"> </w:t>
+      </w:r>
+      <w:r>
+        <w:rPr>
+          <w:rStyle w:val="VerbatimChar"/>
+        </w:rPr>
+        <w:t xml:space="preserve">SitePost</w:t>
+      </w:r>
+      <w:r>
+        <w:t xml:space="preserve"> </w:t>
+      </w:r>
+      <w:r>
+        <w:t xml:space="preserve">model to JSON for the dashboard</w:t>
+      </w:r>
+    </w:p>
+    <w:bookmarkEnd w:id="57"/>
+    <w:bookmarkStart w:id="58" w:name="new-typescript-types"/>
+    <w:p>
+      <w:pPr>
+        <w:pStyle w:val="Heading3"/>
+      </w:pPr>
+      <w:r>
+        <w:t xml:space="preserve">New TypeScript types</w:t>
+      </w:r>
+    </w:p>
+    <w:p>
+      <w:pPr>
+        <w:numPr>
+          <w:ilvl w:val="0"/>
+          <w:numId w:val="1027"/>
+        </w:numPr>
+        <w:pStyle w:val="Compact"/>
+      </w:pPr>
+      <w:r>
+        <w:rPr>
+          <w:rStyle w:val="VerbatimChar"/>
+          <w:bCs/>
+          <w:b/>
+        </w:rPr>
+        <w:t xml:space="preserve">SiteUser</w:t>
+      </w:r>
+      <w:r>
+        <w:t xml:space="preserve"> </w:t>
+      </w:r>
+      <w:r>
+        <w:t xml:space="preserve">interface matching the API resource structure</w:t>
+      </w:r>
+    </w:p>
+    <w:p>
+      <w:pPr>
+        <w:numPr>
+          <w:ilvl w:val="0"/>
+          <w:numId w:val="1027"/>
+        </w:numPr>
+        <w:pStyle w:val="Compact"/>
+      </w:pPr>
+      <w:r>
+        <w:rPr>
+          <w:rStyle w:val="VerbatimChar"/>
+          <w:bCs/>
+          <w:b/>
+        </w:rPr>
+        <w:t xml:space="preserve">SitePost</w:t>
+      </w:r>
+      <w:r>
+        <w:t xml:space="preserve"> </w:t>
+      </w:r>
+      <w:r>
+        <w:t xml:space="preserve">interface matching the API resource structure</w:t>
+      </w:r>
+    </w:p>
+    <w:bookmarkEnd w:id="58"/>
+    <w:bookmarkStart w:id="59" w:name="dashboard-changes"/>
+    <w:p>
+      <w:pPr>
+        <w:pStyle w:val="Heading3"/>
+      </w:pPr>
+      <w:r>
+        <w:t xml:space="preserve">Dashboard changes</w:t>
+      </w:r>
+    </w:p>
+    <w:p>
+      <w:pPr>
+        <w:pStyle w:val="FirstParagraph"/>
+      </w:pPr>
+      <w:r>
+        <w:rPr>
+          <w:bCs/>
+          <w:b/>
+        </w:rPr>
+        <w:t xml:space="preserve">Files modified:</w:t>
+      </w:r>
+      <w:r>
+        <w:t xml:space="preserve"> </w:t>
+      </w:r>
+      <w:r>
+        <w:t xml:space="preserve">-</w:t>
+      </w:r>
+      <w:r>
+        <w:t xml:space="preserve"> </w:t>
+      </w:r>
+      <w:r>
+        <w:rPr>
+          <w:rStyle w:val="VerbatimChar"/>
+        </w:rPr>
+        <w:t xml:space="preserve">apps/dashboard/src/pages/WebsiteDetail.tsx</w:t>
+      </w:r>
+      <w:r>
+        <w:t xml:space="preserve"> </w:t>
+      </w:r>
+      <w:r>
+        <w:t xml:space="preserve">— added two new tabs (</w:t>
+      </w:r>
+      <w:r>
+        <w:rPr>
+          <w:rStyle w:val="VerbatimChar"/>
+        </w:rPr>
+        <w:t xml:space="preserve">Users &amp; Logins</w:t>
+      </w:r>
+      <w:r>
+        <w:t xml:space="preserve">,</w:t>
+      </w:r>
+      <w:r>
+        <w:t xml:space="preserve"> </w:t>
+      </w:r>
+      <w:r>
+        <w:rPr>
+          <w:rStyle w:val="VerbatimChar"/>
+        </w:rPr>
+        <w:t xml:space="preserve">Content</w:t>
+      </w:r>
+      <w:r>
+        <w:t xml:space="preserve">) with full UI implementation</w:t>
+      </w:r>
+      <w:r>
+        <w:t xml:space="preserve"> </w:t>
+      </w:r>
+      <w:r>
+        <w:t xml:space="preserve">-</w:t>
+      </w:r>
+      <w:r>
+        <w:t xml:space="preserve"> </w:t>
+      </w:r>
+      <w:r>
+        <w:rPr>
+          <w:rStyle w:val="VerbatimChar"/>
+        </w:rPr>
+        <w:t xml:space="preserve">apps/dashboard/src/types/index.ts</w:t>
+      </w:r>
+      <w:r>
+        <w:t xml:space="preserve"> </w:t>
+      </w:r>
+      <w:r>
+        <w:t xml:space="preserve">— added</w:t>
+      </w:r>
+      <w:r>
+        <w:t xml:space="preserve"> </w:t>
+      </w:r>
+      <w:r>
+        <w:rPr>
+          <w:rStyle w:val="VerbatimChar"/>
+        </w:rPr>
+        <w:t xml:space="preserve">SiteUser</w:t>
+      </w:r>
+      <w:r>
+        <w:t xml:space="preserve"> </w:t>
+      </w:r>
+      <w:r>
+        <w:t xml:space="preserve">and</w:t>
+      </w:r>
+      <w:r>
+        <w:t xml:space="preserve"> </w:t>
+      </w:r>
+      <w:r>
+        <w:rPr>
+          <w:rStyle w:val="VerbatimChar"/>
+        </w:rPr>
+        <w:t xml:space="preserve">SitePost</w:t>
+      </w:r>
+      <w:r>
+        <w:t xml:space="preserve"> </w:t>
+      </w:r>
+      <w:r>
+        <w:t xml:space="preserve">TypeScript interfaces</w:t>
+      </w:r>
+    </w:p>
+    <w:p>
+      <w:pPr>
+        <w:pStyle w:val="BodyText"/>
+      </w:pPr>
+      <w:r>
+        <w:rPr>
+          <w:bCs/>
+          <w:b/>
+        </w:rPr>
+        <w:t xml:space="preserve">UI features:</w:t>
+      </w:r>
+      <w:r>
+        <w:t xml:space="preserve"> </w:t>
+      </w:r>
+      <w:r>
+        <w:t xml:space="preserve">- Summary cards displaying aggregate counts and most recent activity</w:t>
+      </w:r>
+      <w:r>
+        <w:t xml:space="preserve"> </w:t>
+      </w:r>
+      <w:r>
+        <w:t xml:space="preserve">- Filterable and paginated data tables</w:t>
+      </w:r>
+      <w:r>
+        <w:t xml:space="preserve"> </w:t>
+      </w:r>
+      <w:r>
+        <w:t xml:space="preserve">- Responsive design with mobile support</w:t>
+      </w:r>
+      <w:r>
+        <w:t xml:space="preserve"> </w:t>
+      </w:r>
+      <w:r>
+        <w:t xml:space="preserve">- Empty states for sites with no data yet</w:t>
+      </w:r>
+      <w:r>
+        <w:t xml:space="preserve"> </w:t>
+      </w:r>
+      <w:r>
+        <w:t xml:space="preserve">- Role badges, status badges with appropriate color coding</w:t>
+      </w:r>
+      <w:r>
+        <w:t xml:space="preserve"> </w:t>
+      </w:r>
+      <w:r>
+        <w:t xml:space="preserve">- Clickable links to view posts on the WordPress site</w:t>
+      </w:r>
+    </w:p>
+    <w:bookmarkEnd w:id="59"/>
+    <w:bookmarkStart w:id="60" w:name="manual-steps-after-redeploy-5"/>
+    <w:p>
+      <w:pPr>
+        <w:pStyle w:val="Heading3"/>
+      </w:pPr>
+      <w:r>
+        <w:t xml:space="preserve">Manual steps after redeploy</w:t>
+      </w:r>
+    </w:p>
+    <w:p>
+      <w:pPr>
+        <w:numPr>
+          <w:ilvl w:val="0"/>
+          <w:numId w:val="1028"/>
+        </w:numPr>
+      </w:pPr>
+      <w:r>
+        <w:rPr>
+          <w:bCs/>
+          <w:b/>
+        </w:rPr>
+        <w:t xml:space="preserve">Dashboard redeploy required</w:t>
+      </w:r>
+      <w:r>
+        <w:t xml:space="preserve"> </w:t>
+      </w:r>
+      <w:r>
+        <w:t xml:space="preserve">— the React app must be rebuilt and redeployed to show the new tabs.</w:t>
+      </w:r>
+    </w:p>
+    <w:p>
+      <w:pPr>
+        <w:numPr>
+          <w:ilvl w:val="0"/>
+          <w:numId w:val="1028"/>
+        </w:numPr>
+      </w:pPr>
+      <w:r>
+        <w:rPr>
+          <w:bCs/>
+          <w:b/>
+        </w:rPr>
+        <w:t xml:space="preserve">API redeploy required</w:t>
+      </w:r>
+      <w:r>
+        <w:t xml:space="preserve"> </w:t>
+      </w:r>
+      <w:r>
+        <w:t xml:space="preserve">— to expose the new</w:t>
+      </w:r>
+      <w:r>
+        <w:t xml:space="preserve"> </w:t>
+      </w:r>
+      <w:r>
+        <w:rPr>
+          <w:rStyle w:val="VerbatimChar"/>
+        </w:rPr>
+        <w:t xml:space="preserve">/users</w:t>
+      </w:r>
+      <w:r>
+        <w:t xml:space="preserve"> </w:t>
+      </w:r>
+      <w:r>
+        <w:t xml:space="preserve">and</w:t>
+      </w:r>
+      <w:r>
+        <w:t xml:space="preserve"> </w:t>
+      </w:r>
+      <w:r>
+        <w:rPr>
+          <w:rStyle w:val="VerbatimChar"/>
+        </w:rPr>
+        <w:t xml:space="preserve">/posts</w:t>
+      </w:r>
+      <w:r>
+        <w:t xml:space="preserve"> </w:t>
+      </w:r>
+      <w:r>
+        <w:t xml:space="preserve">endpoints (though the backend code changes are minimal).</w:t>
+      </w:r>
+    </w:p>
+    <w:p>
+      <w:pPr>
+        <w:numPr>
+          <w:ilvl w:val="0"/>
+          <w:numId w:val="1028"/>
+        </w:numPr>
+      </w:pPr>
+      <w:r>
+        <w:rPr>
+          <w:bCs/>
+          <w:b/>
+        </w:rPr>
+        <w:t xml:space="preserve">No migrations required</w:t>
+      </w:r>
+      <w:r>
+        <w:t xml:space="preserve"> </w:t>
+      </w:r>
+      <w:r>
+        <w:t xml:space="preserve">— all database tables already exist from Increment 5.</w:t>
+      </w:r>
+    </w:p>
+    <w:p>
+      <w:pPr>
+        <w:numPr>
+          <w:ilvl w:val="0"/>
+          <w:numId w:val="1028"/>
+        </w:numPr>
+      </w:pPr>
+      <w:r>
+        <w:rPr>
+          <w:bCs/>
+          <w:b/>
+        </w:rPr>
+        <w:t xml:space="preserve">No connector changes</w:t>
+      </w:r>
+      <w:r>
+        <w:t xml:space="preserve"> </w:t>
+      </w:r>
+      <w:r>
+        <w:t xml:space="preserve">— this increment is dashboard-only.</w:t>
+      </w:r>
+    </w:p>
+    <w:bookmarkEnd w:id="60"/>
+    <w:bookmarkStart w:id="61" w:name="testing"/>
+    <w:p>
+      <w:pPr>
+        <w:pStyle w:val="Heading3"/>
+      </w:pPr>
+      <w:r>
+        <w:t xml:space="preserve">Testing</w:t>
+      </w:r>
+    </w:p>
+    <w:p>
+      <w:pPr>
+        <w:numPr>
+          <w:ilvl w:val="0"/>
+          <w:numId w:val="1029"/>
+        </w:numPr>
+        <w:pStyle w:val="Compact"/>
+      </w:pPr>
+      <w:r>
+        <w:rPr>
+          <w:bCs/>
+          <w:b/>
+        </w:rPr>
+        <w:t xml:space="preserve">API:</w:t>
+      </w:r>
+      <w:r>
+        <w:t xml:space="preserve"> </w:t>
+      </w:r>
+      <w:r>
+        <w:t xml:space="preserve">Existing test suite remains at</w:t>
+      </w:r>
+      <w:r>
+        <w:t xml:space="preserve"> </w:t>
+      </w:r>
+      <w:r>
+        <w:rPr>
+          <w:bCs/>
+          <w:b/>
+        </w:rPr>
+        <w:t xml:space="preserve">113 passing</w:t>
+      </w:r>
+      <w:r>
+        <w:t xml:space="preserve">. The new endpoints reuse existing authorization and tenant-scoping logic, which is already comprehensively tested.</w:t>
+      </w:r>
+    </w:p>
+    <w:p>
+      <w:pPr>
+        <w:numPr>
+          <w:ilvl w:val="0"/>
+          <w:numId w:val="1029"/>
+        </w:numPr>
+        <w:pStyle w:val="Compact"/>
+      </w:pPr>
+      <w:r>
+        <w:rPr>
+          <w:bCs/>
+          <w:b/>
+        </w:rPr>
+        <w:t xml:space="preserve">Dashboard:</w:t>
+      </w:r>
+      <w:r>
+        <w:t xml:space="preserve"> </w:t>
+      </w:r>
+      <w:r>
+        <w:t xml:space="preserve">TypeScript build succeeds with zero errors. Manual testing confirmed:</w:t>
+      </w:r>
+    </w:p>
+    <w:p>
+      <w:pPr>
+        <w:numPr>
+          <w:ilvl w:val="1"/>
+          <w:numId w:val="1030"/>
+        </w:numPr>
+        <w:pStyle w:val="Compact"/>
+      </w:pPr>
+      <w:r>
+        <w:t xml:space="preserve">Empty states display correctly for sites with no user/post data</w:t>
+      </w:r>
+    </w:p>
+    <w:p>
+      <w:pPr>
+        <w:numPr>
+          <w:ilvl w:val="1"/>
+          <w:numId w:val="1030"/>
+        </w:numPr>
+        <w:pStyle w:val="Compact"/>
+      </w:pPr>
+      <w:r>
+        <w:t xml:space="preserve">Pagination works correctly</w:t>
+      </w:r>
+    </w:p>
+    <w:p>
+      <w:pPr>
+        <w:numPr>
+          <w:ilvl w:val="1"/>
+          <w:numId w:val="1030"/>
+        </w:numPr>
+        <w:pStyle w:val="Compact"/>
+      </w:pPr>
+      <w:r>
+        <w:t xml:space="preserve">Filters work correctly (content status filter)</w:t>
+      </w:r>
+    </w:p>
+    <w:p>
+      <w:pPr>
+        <w:numPr>
+          <w:ilvl w:val="1"/>
+          <w:numId w:val="1030"/>
+        </w:numPr>
+        <w:pStyle w:val="Compact"/>
+      </w:pPr>
+      <w:r>
+        <w:t xml:space="preserve">Data displays correctly when present</w:t>
+      </w:r>
+    </w:p>
+    <w:p>
+      <w:pPr>
+        <w:numPr>
+          <w:ilvl w:val="1"/>
+          <w:numId w:val="1030"/>
+        </w:numPr>
+        <w:pStyle w:val="Compact"/>
+      </w:pPr>
+      <w:r>
+        <w:t xml:space="preserve">Tenant scoping prevents cross-tenant access</w:t>
+      </w:r>
+    </w:p>
+    <w:bookmarkEnd w:id="61"/>
+    <w:bookmarkStart w:id="62" w:name="rollback-5"/>
+    <w:p>
+      <w:pPr>
+        <w:pStyle w:val="Heading3"/>
+      </w:pPr>
+      <w:r>
+        <w:t xml:space="preserve">Rollback</w:t>
+      </w:r>
+    </w:p>
+    <w:p>
+      <w:pPr>
+        <w:numPr>
+          <w:ilvl w:val="0"/>
+          <w:numId w:val="1031"/>
+        </w:numPr>
+        <w:pStyle w:val="Compact"/>
+      </w:pPr>
+      <w:r>
+        <w:rPr>
+          <w:bCs/>
+          <w:b/>
+        </w:rPr>
+        <w:t xml:space="preserve">Dashboard:</w:t>
+      </w:r>
+      <w:r>
+        <w:t xml:space="preserve"> </w:t>
+      </w:r>
+      <w:r>
+        <w:t xml:space="preserve">redeploy the previous frontend build. The new tabs will disappear but existing tabs remain functional.</w:t>
+      </w:r>
+    </w:p>
+    <w:p>
+      <w:pPr>
+        <w:numPr>
+          <w:ilvl w:val="0"/>
+          <w:numId w:val="1031"/>
+        </w:numPr>
+        <w:pStyle w:val="Compact"/>
+      </w:pPr>
+      <w:r>
+        <w:rPr>
+          <w:bCs/>
+          <w:b/>
+        </w:rPr>
+        <w:t xml:space="preserve">API:</w:t>
+      </w:r>
+      <w:r>
+        <w:t xml:space="preserve"> </w:t>
+      </w:r>
+      <w:r>
+        <w:t xml:space="preserve">revert</w:t>
+      </w:r>
+      <w:r>
+        <w:t xml:space="preserve"> </w:t>
+      </w:r>
+      <w:r>
+        <w:rPr>
+          <w:rStyle w:val="VerbatimChar"/>
+        </w:rPr>
+        <w:t xml:space="preserve">SiteController.php</w:t>
+      </w:r>
+      <w:r>
+        <w:t xml:space="preserve"> </w:t>
+      </w:r>
+      <w:r>
+        <w:t xml:space="preserve">and</w:t>
+      </w:r>
+      <w:r>
+        <w:t xml:space="preserve"> </w:t>
+      </w:r>
+      <w:r>
+        <w:rPr>
+          <w:rStyle w:val="VerbatimChar"/>
+        </w:rPr>
+        <w:t xml:space="preserve">routes/api.php</w:t>
+      </w:r>
+      <w:r>
+        <w:t xml:space="preserve">. Remove</w:t>
+      </w:r>
+      <w:r>
+        <w:t xml:space="preserve"> </w:t>
+      </w:r>
+      <w:r>
+        <w:rPr>
+          <w:rStyle w:val="VerbatimChar"/>
+        </w:rPr>
+        <w:t xml:space="preserve">SiteUserResource.php</w:t>
+      </w:r>
+      <w:r>
+        <w:t xml:space="preserve"> </w:t>
+      </w:r>
+      <w:r>
+        <w:t xml:space="preserve">and</w:t>
+      </w:r>
+      <w:r>
+        <w:t xml:space="preserve"> </w:t>
+      </w:r>
+      <w:r>
+        <w:rPr>
+          <w:rStyle w:val="VerbatimChar"/>
+        </w:rPr>
+        <w:t xml:space="preserve">SitePostResource.php</w:t>
+      </w:r>
+      <w:r>
+        <w:t xml:space="preserve">.</w:t>
+      </w:r>
+    </w:p>
+    <w:p>
+      <w:pPr>
+        <w:numPr>
+          <w:ilvl w:val="0"/>
+          <w:numId w:val="1031"/>
+        </w:numPr>
+        <w:pStyle w:val="Compact"/>
+      </w:pPr>
+      <w:r>
+        <w:rPr>
+          <w:bCs/>
+          <w:b/>
+        </w:rPr>
+        <w:t xml:space="preserve">No database changes</w:t>
+      </w:r>
+      <w:r>
+        <w:t xml:space="preserve"> </w:t>
+      </w:r>
+      <w:r>
+        <w:t xml:space="preserve">— tables created in Increment 5 remain intact.</w:t>
+      </w:r>
+    </w:p>
+    <w:bookmarkEnd w:id="62"/>
+    <w:bookmarkStart w:id="63" w:name="whats-included"/>
+    <w:p>
+      <w:pPr>
+        <w:pStyle w:val="Heading3"/>
+      </w:pPr>
+      <w:r>
+        <w:t xml:space="preserve">What’s included</w:t>
+      </w:r>
+    </w:p>
+    <w:p>
+      <w:pPr>
+        <w:pStyle w:val="FirstParagraph"/>
+      </w:pPr>
+      <w:r>
+        <w:t xml:space="preserve">✅</w:t>
+      </w:r>
+      <w:r>
+        <w:t xml:space="preserve"> </w:t>
+      </w:r>
+      <w:r>
+        <w:rPr>
+          <w:bCs/>
+          <w:b/>
+        </w:rPr>
+        <w:t xml:space="preserve">Dashboard display of user data</w:t>
+      </w:r>
+      <w:r>
+        <w:t xml:space="preserve"> </w:t>
+      </w:r>
+      <w:r>
+        <w:t xml:space="preserve">— total count, last login, user table</w:t>
+      </w:r>
+      <w:r>
+        <w:br/>
+      </w:r>
+      <w:r>
+        <w:t xml:space="preserve">✅</w:t>
+      </w:r>
+      <w:r>
+        <w:t xml:space="preserve"> </w:t>
+      </w:r>
+      <w:r>
+        <w:rPr>
+          <w:bCs/>
+          <w:b/>
+        </w:rPr>
+        <w:t xml:space="preserve">Dashboard display of content data</w:t>
+      </w:r>
+      <w:r>
+        <w:t xml:space="preserve"> </w:t>
+      </w:r>
+      <w:r>
+        <w:t xml:space="preserve">— post/page listings with metadata</w:t>
+      </w:r>
+      <w:r>
+        <w:br/>
+      </w:r>
+      <w:r>
+        <w:t xml:space="preserve">✅</w:t>
+      </w:r>
+      <w:r>
+        <w:t xml:space="preserve"> </w:t>
+      </w:r>
+      <w:r>
+        <w:rPr>
+          <w:bCs/>
+          <w:b/>
+        </w:rPr>
+        <w:t xml:space="preserve">Pagination and filtering</w:t>
+      </w:r>
+      <w:r>
+        <w:t xml:space="preserve"> </w:t>
+      </w:r>
+      <w:r>
+        <w:t xml:space="preserve">— handle large datasets gracefully</w:t>
+      </w:r>
+      <w:r>
+        <w:br/>
+      </w:r>
+      <w:r>
+        <w:t xml:space="preserve">✅</w:t>
+      </w:r>
+      <w:r>
+        <w:t xml:space="preserve"> </w:t>
+      </w:r>
+      <w:r>
+        <w:rPr>
+          <w:bCs/>
+          <w:b/>
+        </w:rPr>
+        <w:t xml:space="preserve">Empty states</w:t>
+      </w:r>
+      <w:r>
+        <w:t xml:space="preserve"> </w:t>
+      </w:r>
+      <w:r>
+        <w:t xml:space="preserve">— clear messaging when no data is available yet</w:t>
+      </w:r>
+      <w:r>
+        <w:br/>
+      </w:r>
+      <w:r>
+        <w:t xml:space="preserve">✅</w:t>
+      </w:r>
+      <w:r>
+        <w:t xml:space="preserve"> </w:t>
+      </w:r>
+      <w:r>
+        <w:rPr>
+          <w:bCs/>
+          <w:b/>
+        </w:rPr>
+        <w:t xml:space="preserve">Authorization</w:t>
+      </w:r>
+      <w:r>
+        <w:t xml:space="preserve"> </w:t>
+      </w:r>
+      <w:r>
+        <w:t xml:space="preserve">— Subscribers see only their own sites’ data; Owner sees all</w:t>
+      </w:r>
+      <w:r>
+        <w:br/>
+      </w:r>
+      <w:r>
+        <w:t xml:space="preserve">✅</w:t>
+      </w:r>
+      <w:r>
+        <w:t xml:space="preserve"> </w:t>
+      </w:r>
+      <w:r>
+        <w:rPr>
+          <w:bCs/>
+          <w:b/>
+        </w:rPr>
+        <w:t xml:space="preserve">Production build</w:t>
+      </w:r>
+      <w:r>
+        <w:t xml:space="preserve"> </w:t>
+      </w:r>
+      <w:r>
+        <w:t xml:space="preserve">— dashboard builds successfully with no TypeScript errors</w:t>
+      </w:r>
+    </w:p>
+    <w:bookmarkEnd w:id="63"/>
+    <w:bookmarkStart w:id="64" w:name="Xbbb85259bbea0c51c073e9ef6ec0316ef44d9c1"/>
+    <w:p>
+      <w:pPr>
+        <w:pStyle w:val="Heading3"/>
+      </w:pPr>
+      <w:r>
+        <w:t xml:space="preserve">What’s still NOT included (deferred to future work or already complete)</w:t>
+      </w:r>
+    </w:p>
+    <w:p>
+      <w:pPr>
+        <w:numPr>
+          <w:ilvl w:val="0"/>
+          <w:numId w:val="1032"/>
+        </w:numPr>
+        <w:pStyle w:val="Compact"/>
+      </w:pPr>
+      <w:r>
+        <w:rPr>
+          <w:bCs/>
+          <w:b/>
+        </w:rPr>
+        <w:t xml:space="preserve">Automatic data collection scheduling</w:t>
+      </w:r>
+      <w:r>
+        <w:t xml:space="preserve"> </w:t>
+      </w:r>
+      <w:r>
+        <w:t xml:space="preserve">— data collection exists but is not yet auto-scheduled (Increment 5 note)</w:t>
+      </w:r>
+    </w:p>
+    <w:p>
+      <w:pPr>
+        <w:numPr>
+          <w:ilvl w:val="0"/>
+          <w:numId w:val="1032"/>
+        </w:numPr>
+        <w:pStyle w:val="Compact"/>
+      </w:pPr>
+      <w:r>
+        <w:rPr>
+          <w:bCs/>
+          <w:b/>
+        </w:rPr>
+        <w:t xml:space="preserve">Privacy controls</w:t>
+      </w:r>
+      <w:r>
+        <w:t xml:space="preserve"> </w:t>
+      </w:r>
+      <w:r>
+        <w:t xml:space="preserve">— email redaction/hashing (future enhancement)</w:t>
+      </w:r>
+    </w:p>
+    <w:p>
+      <w:pPr>
+        <w:numPr>
+          <w:ilvl w:val="0"/>
+          <w:numId w:val="1032"/>
+        </w:numPr>
+        <w:pStyle w:val="Compact"/>
+      </w:pPr>
+      <w:r>
+        <w:rPr>
+          <w:bCs/>
+          <w:b/>
+        </w:rPr>
+        <w:t xml:space="preserve">Real-time updates</w:t>
+      </w:r>
+      <w:r>
+        <w:t xml:space="preserve"> </w:t>
+      </w:r>
+      <w:r>
+        <w:t xml:space="preserve">— dashboard data refreshes on page load/navigation, not live WebSocket updates</w:t>
+      </w:r>
+    </w:p>
+    <w:p>
+      <w:pPr>
+        <w:numPr>
+          <w:ilvl w:val="0"/>
+          <w:numId w:val="1032"/>
+        </w:numPr>
+        <w:pStyle w:val="Compact"/>
+      </w:pPr>
+      <w:r>
+        <w:rPr>
+          <w:bCs/>
+          <w:b/>
+        </w:rPr>
+        <w:t xml:space="preserve">Export functionality</w:t>
+      </w:r>
+      <w:r>
+        <w:t xml:space="preserve"> </w:t>
+      </w:r>
+      <w:r>
+        <w:t xml:space="preserve">— no CSV/PDF export of user/post data yet</w:t>
+      </w:r>
+    </w:p>
+    <w:p>
+      <w:r>
+        <w:pict>
+          <v:rect style="width:0;height:1.5pt" o:hralign="center" o:hrstd="t" o:hr="t"/>
+        </w:pict>
+      </w:r>
+    </w:p>
+    <w:bookmarkEnd w:id="64"/>
+    <w:bookmarkEnd w:id="65"/>
+    <w:bookmarkEnd w:id="66"/>
     <w:sectPr/>
   </w:body>
 </w:document>
@@ -7766,6 +9147,93 @@
     <w:abstractNumId w:val="991"/>
   </w:num>
   <w:num w:numId="1021">
+    <w:abstractNumId w:val="991"/>
+  </w:num>
+  <w:num w:numId="1022">
+    <w:abstractNumId w:val="99411"/>
+    <w:lvlOverride w:ilvl="0">
+      <w:startOverride w:val="1"/>
+    </w:lvlOverride>
+    <w:lvlOverride w:ilvl="1">
+      <w:startOverride w:val="1"/>
+    </w:lvlOverride>
+    <w:lvlOverride w:ilvl="2">
+      <w:startOverride w:val="1"/>
+    </w:lvlOverride>
+    <w:lvlOverride w:ilvl="3">
+      <w:startOverride w:val="1"/>
+    </w:lvlOverride>
+    <w:lvlOverride w:ilvl="4">
+      <w:startOverride w:val="1"/>
+    </w:lvlOverride>
+    <w:lvlOverride w:ilvl="5">
+      <w:startOverride w:val="1"/>
+    </w:lvlOverride>
+    <w:lvlOverride w:ilvl="6">
+      <w:startOverride w:val="1"/>
+    </w:lvlOverride>
+    <w:lvlOverride w:ilvl="7">
+      <w:startOverride w:val="1"/>
+    </w:lvlOverride>
+    <w:lvlOverride w:ilvl="8">
+      <w:startOverride w:val="1"/>
+    </w:lvlOverride>
+  </w:num>
+  <w:num w:numId="1023">
+    <w:abstractNumId w:val="991"/>
+  </w:num>
+  <w:num w:numId="1024">
+    <w:abstractNumId w:val="991"/>
+  </w:num>
+  <w:num w:numId="1025">
+    <w:abstractNumId w:val="991"/>
+  </w:num>
+  <w:num w:numId="1026">
+    <w:abstractNumId w:val="991"/>
+  </w:num>
+  <w:num w:numId="1027">
+    <w:abstractNumId w:val="991"/>
+  </w:num>
+  <w:num w:numId="1028">
+    <w:abstractNumId w:val="99411"/>
+    <w:lvlOverride w:ilvl="0">
+      <w:startOverride w:val="1"/>
+    </w:lvlOverride>
+    <w:lvlOverride w:ilvl="1">
+      <w:startOverride w:val="1"/>
+    </w:lvlOverride>
+    <w:lvlOverride w:ilvl="2">
+      <w:startOverride w:val="1"/>
+    </w:lvlOverride>
+    <w:lvlOverride w:ilvl="3">
+      <w:startOverride w:val="1"/>
+    </w:lvlOverride>
+    <w:lvlOverride w:ilvl="4">
+      <w:startOverride w:val="1"/>
+    </w:lvlOverride>
+    <w:lvlOverride w:ilvl="5">
+      <w:startOverride w:val="1"/>
+    </w:lvlOverride>
+    <w:lvlOverride w:ilvl="6">
+      <w:startOverride w:val="1"/>
+    </w:lvlOverride>
+    <w:lvlOverride w:ilvl="7">
+      <w:startOverride w:val="1"/>
+    </w:lvlOverride>
+    <w:lvlOverride w:ilvl="8">
+      <w:startOverride w:val="1"/>
+    </w:lvlOverride>
+  </w:num>
+  <w:num w:numId="1029">
+    <w:abstractNumId w:val="991"/>
+  </w:num>
+  <w:num w:numId="1030">
+    <w:abstractNumId w:val="991"/>
+  </w:num>
+  <w:num w:numId="1031">
+    <w:abstractNumId w:val="991"/>
+  </w:num>
+  <w:num w:numId="1032">
     <w:abstractNumId w:val="991"/>
   </w:num>
 </w:numbering>

</xml_diff>

<commit_message>
docs: record Increment 6 commit hash in deployment runbook
</commit_message>
<xml_diff>
--- a/docs/RELEASE_1.2.0_DEPLOYMENT.docx
+++ b/docs/RELEASE_1.2.0_DEPLOYMENT.docx
@@ -7279,7 +7279,7 @@
         <w:rPr>
           <w:rStyle w:val="VerbatimChar"/>
         </w:rPr>
-        <w:t xml:space="preserve">[TBD]</w:t>
+        <w:t xml:space="preserve">c34245b</w:t>
       </w:r>
       <w:r>
         <w:t xml:space="preserve"> </w:t>
@@ -7295,7 +7295,7 @@
         <w:t xml:space="preserve"> </w:t>
       </w:r>
       <w:r>
-        <w:t xml:space="preserve">Low. Frontend-only changes to the dashboard; no API changes, no migrations, no connector changes.</w:t>
+        <w:t xml:space="preserve">Low. Dashboard + API endpoint additions; no migrations, no connector changes, no breaking changes.</w:t>
       </w:r>
     </w:p>
     <w:bookmarkStart w:id="55" w:name="what-changed"/>

</xml_diff>